<commit_message>
Final version of the boltzmann is here
</commit_message>
<xml_diff>
--- a/Boltzman Speed Distribution/Report/Report.docx
+++ b/Boltzman Speed Distribution/Report/Report.docx
@@ -73,7 +73,7 @@
               </wp:anchor>
             </w:drawing>
           </mc:Choice>
-          <mc:Fallback xmlns:w16sdtfl="http://schemas.microsoft.com/office/word/2024/wordml/sdtformatlock" xmlns:w16du="http://schemas.microsoft.com/office/word/2023/wordml/word16du" xmlns:oel="http://schemas.microsoft.com/office/2019/extlst">
+          <mc:Fallback xmlns:oel="http://schemas.microsoft.com/office/2019/extlst" xmlns:w16du="http://schemas.microsoft.com/office/word/2023/wordml/word16du" xmlns:w16sdtfl="http://schemas.microsoft.com/office/word/2024/wordml/sdtformatlock">
             <w:pict>
               <v:line w14:anchorId="04FA1717" id="Line 50" o:spid="_x0000_s1026" style="position:absolute;z-index:251656192;visibility:visible;mso-wrap-style:square;mso-width-percent:0;mso-height-percent:0;mso-wrap-distance-left:9pt;mso-wrap-distance-top:0;mso-wrap-distance-right:9pt;mso-wrap-distance-bottom:0;mso-position-horizontal:absolute;mso-position-horizontal-relative:text;mso-position-vertical:absolute;mso-position-vertical-relative:text;mso-width-percent:0;mso-height-percent:0;mso-width-relative:page;mso-height-relative:page" from="0,5.2pt" to="519.75pt,5.2pt" o:gfxdata="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" strokeweight="3pt"/>
             </w:pict>
@@ -3858,7 +3858,21 @@
           <w:sz w:val="20"/>
           <w:szCs w:val="20"/>
         </w:rPr>
-        <w:t>Position of four randomly taken particles are tracked as an array which has discrete datapoints for 25 seconds with interval of a milli second.</w:t>
+        <w:t xml:space="preserve">Position of four randomly taken particles are tracked as an array which has discrete datapoints for </w:t>
+      </w:r>
+      <w:r>
+        <w:rPr>
+          <w:sz w:val="20"/>
+          <w:szCs w:val="20"/>
+        </w:rPr>
+        <w:t xml:space="preserve">60 </w:t>
+      </w:r>
+      <w:r>
+        <w:rPr>
+          <w:sz w:val="20"/>
+          <w:szCs w:val="20"/>
+        </w:rPr>
+        <w:t>seconds with interval of a milli second.</w:t>
       </w:r>
     </w:p>
     <w:p>
@@ -3888,10 +3902,10 @@
           <w:szCs w:val="20"/>
         </w:rPr>
         <w:drawing>
-          <wp:inline distT="0" distB="0" distL="0" distR="0" wp14:anchorId="0EA9E550" wp14:editId="631C5E40">
+          <wp:inline distT="0" distB="0" distL="0" distR="0" wp14:anchorId="4AF26148" wp14:editId="7196D3AD">
             <wp:extent cx="3179445" cy="1868170"/>
             <wp:effectExtent l="0" t="0" r="1905" b="0"/>
-            <wp:docPr id="6" name="Picture 6"/>
+            <wp:docPr id="11" name="Picture 11"/>
             <wp:cNvGraphicFramePr>
               <a:graphicFrameLocks xmlns:a="http://schemas.openxmlformats.org/drawingml/2006/main" noChangeAspect="1"/>
             </wp:cNvGraphicFramePr>
@@ -3976,7 +3990,21 @@
           <w:sz w:val="20"/>
           <w:szCs w:val="20"/>
         </w:rPr>
-        <w:t xml:space="preserve">The speed is tracked for 25 seconds with interval of a milli second to study the </w:t>
+        <w:t xml:space="preserve">The speed is tracked for </w:t>
+      </w:r>
+      <w:r>
+        <w:rPr>
+          <w:sz w:val="20"/>
+          <w:szCs w:val="20"/>
+        </w:rPr>
+        <w:t>60</w:t>
+      </w:r>
+      <w:r>
+        <w:rPr>
+          <w:sz w:val="20"/>
+          <w:szCs w:val="20"/>
+        </w:rPr>
+        <w:t xml:space="preserve"> seconds with interval of a milli second to study the </w:t>
       </w:r>
       <w:r>
         <w:rPr>
@@ -3990,7 +4018,28 @@
           <w:sz w:val="20"/>
           <w:szCs w:val="20"/>
         </w:rPr>
-        <w:t>energy, entropy evolution in the system</w:t>
+        <w:t>energy</w:t>
+      </w:r>
+      <w:r>
+        <w:rPr>
+          <w:sz w:val="20"/>
+          <w:szCs w:val="20"/>
+        </w:rPr>
+        <w:t>, pressure</w:t>
+      </w:r>
+      <w:r>
+        <w:rPr>
+          <w:sz w:val="20"/>
+          <w:szCs w:val="20"/>
+        </w:rPr>
+        <w:t xml:space="preserve"> and entropy</w:t>
+      </w:r>
+      <w:r>
+        <w:rPr>
+          <w:sz w:val="20"/>
+          <w:szCs w:val="20"/>
+        </w:rPr>
+        <w:t xml:space="preserve"> evolution in the system</w:t>
       </w:r>
     </w:p>
     <w:p>
@@ -4122,59 +4171,70 @@
     <w:p>
       <w:pPr>
         <w:ind w:firstLine="270"/>
-        <w:rPr>
-          <w:sz w:val="20"/>
-          <w:szCs w:val="20"/>
-        </w:rPr>
-      </w:pPr>
-      <w:r>
-        <w:rPr>
-          <w:noProof/>
-          <w:sz w:val="20"/>
-          <w:szCs w:val="20"/>
-        </w:rPr>
-        <w:drawing>
-          <wp:inline distT="0" distB="0" distL="0" distR="0" wp14:anchorId="7D3FAEC3" wp14:editId="6B256844">
-            <wp:extent cx="3179445" cy="1788160"/>
-            <wp:effectExtent l="0" t="0" r="1905" b="2540"/>
-            <wp:docPr id="3" name="Picture 3"/>
-            <wp:cNvGraphicFramePr>
-              <a:graphicFrameLocks xmlns:a="http://schemas.openxmlformats.org/drawingml/2006/main" noChangeAspect="1"/>
-            </wp:cNvGraphicFramePr>
-            <a:graphic xmlns:a="http://schemas.openxmlformats.org/drawingml/2006/main">
-              <a:graphicData uri="http://schemas.openxmlformats.org/drawingml/2006/picture">
-                <pic:pic xmlns:pic="http://schemas.openxmlformats.org/drawingml/2006/picture">
-                  <pic:nvPicPr>
-                    <pic:cNvPr id="3" name="Picture 3"/>
-                    <pic:cNvPicPr/>
-                  </pic:nvPicPr>
-                  <pic:blipFill>
-                    <a:blip r:embed="rId14" cstate="print">
-                      <a:extLst>
-                        <a:ext uri="{28A0092B-C50C-407E-A947-70E740481C1C}">
-                          <a14:useLocalDpi xmlns:a14="http://schemas.microsoft.com/office/drawing/2010/main" val="0"/>
-                        </a:ext>
-                      </a:extLst>
-                    </a:blip>
-                    <a:stretch>
-                      <a:fillRect/>
-                    </a:stretch>
-                  </pic:blipFill>
-                  <pic:spPr>
-                    <a:xfrm>
-                      <a:off x="0" y="0"/>
-                      <a:ext cx="3179445" cy="1788160"/>
-                    </a:xfrm>
-                    <a:prstGeom prst="rect">
-                      <a:avLst/>
-                    </a:prstGeom>
-                  </pic:spPr>
-                </pic:pic>
-              </a:graphicData>
-            </a:graphic>
-          </wp:inline>
-        </w:drawing>
-      </w:r>
+        <w:jc w:val="both"/>
+        <w:rPr>
+          <w:sz w:val="20"/>
+          <w:szCs w:val="20"/>
+        </w:rPr>
+      </w:pPr>
+    </w:p>
+    <w:p>
+      <w:pPr>
+        <w:ind w:firstLine="270"/>
+        <w:jc w:val="both"/>
+        <w:rPr>
+          <w:sz w:val="20"/>
+          <w:szCs w:val="20"/>
+        </w:rPr>
+      </w:pPr>
+    </w:p>
+    <w:p>
+      <w:pPr>
+        <w:ind w:firstLine="270"/>
+        <w:jc w:val="center"/>
+        <w:rPr>
+          <w:sz w:val="20"/>
+          <w:szCs w:val="20"/>
+        </w:rPr>
+      </w:pPr>
+      <w:r>
+        <w:rPr>
+          <w:sz w:val="20"/>
+          <w:szCs w:val="20"/>
+          <w:highlight w:val="lightGray"/>
+        </w:rPr>
+        <w:t xml:space="preserve">Animation of the Speed Distribution can be </w:t>
+      </w:r>
+      <w:hyperlink r:id="rId14" w:history="1">
+        <w:r>
+          <w:rPr>
+            <w:rStyle w:val="Hyperlink"/>
+            <w:sz w:val="20"/>
+            <w:szCs w:val="20"/>
+            <w:highlight w:val="lightGray"/>
+          </w:rPr>
+          <w:t>seen here</w:t>
+        </w:r>
+      </w:hyperlink>
+    </w:p>
+    <w:p>
+      <w:pPr>
+        <w:ind w:firstLine="270"/>
+        <w:rPr>
+          <w:sz w:val="20"/>
+          <w:szCs w:val="20"/>
+        </w:rPr>
+      </w:pPr>
+    </w:p>
+    <w:p>
+      <w:pPr>
+        <w:ind w:firstLine="270"/>
+        <w:jc w:val="both"/>
+        <w:rPr>
+          <w:sz w:val="20"/>
+          <w:szCs w:val="20"/>
+        </w:rPr>
+      </w:pPr>
     </w:p>
     <w:p>
       <w:pPr>
@@ -4360,6 +4420,22 @@
         </w:rPr>
         <w:t xml:space="preserve"> Distribution for the speeds in equilibrium. General form of Rayleigh Distribution can be given as,</w:t>
       </w:r>
+      <w:r>
+        <w:rPr>
+          <w:sz w:val="20"/>
+          <w:szCs w:val="20"/>
+        </w:rPr>
+        <w:t xml:space="preserve"> </w:t>
+      </w:r>
+    </w:p>
+    <w:p>
+      <w:pPr>
+        <w:jc w:val="both"/>
+        <w:rPr>
+          <w:sz w:val="20"/>
+          <w:szCs w:val="20"/>
+        </w:rPr>
+      </w:pPr>
     </w:p>
     <w:p>
       <w:pPr>
@@ -4384,6 +4460,7 @@
               <w:sz w:val="20"/>
               <w:szCs w:val="20"/>
             </w:rPr>
+            <w:lastRenderedPageBreak/>
             <m:t>f</m:t>
           </m:r>
           <m:d>
@@ -4611,19 +4688,11 @@
     </w:p>
     <w:p>
       <w:pPr>
-        <w:jc w:val="both"/>
-        <w:rPr>
-          <w:sz w:val="20"/>
-          <w:szCs w:val="20"/>
-        </w:rPr>
-      </w:pPr>
-      <w:r>
-        <w:rPr>
-          <w:sz w:val="20"/>
-          <w:szCs w:val="20"/>
-        </w:rPr>
-        <w:t xml:space="preserve">Where </w:t>
-      </w:r>
+        <w:rPr>
+          <w:sz w:val="20"/>
+          <w:szCs w:val="20"/>
+        </w:rPr>
+      </w:pPr>
       <m:oMath>
         <m:r>
           <w:rPr>
@@ -4639,17 +4708,16 @@
           <w:sz w:val="20"/>
           <w:szCs w:val="20"/>
         </w:rPr>
-        <w:t xml:space="preserve"> is the scale factor of Rayleigh’s </w:t>
-      </w:r>
-      <w:proofErr w:type="gramStart"/>
-      <w:r>
-        <w:rPr>
-          <w:sz w:val="20"/>
-          <w:szCs w:val="20"/>
-        </w:rPr>
-        <w:t>Distribution,</w:t>
-      </w:r>
-      <w:proofErr w:type="gramEnd"/>
+        <w:t xml:space="preserve"> is the scale factor of Rayleigh’s Distribution,</w:t>
+      </w:r>
+    </w:p>
+    <w:p>
+      <w:pPr>
+        <w:rPr>
+          <w:sz w:val="20"/>
+          <w:szCs w:val="20"/>
+        </w:rPr>
+      </w:pPr>
     </w:p>
     <w:p>
       <w:pPr>
@@ -4764,6 +4832,14 @@
           </m:d>
         </m:oMath>
       </m:oMathPara>
+    </w:p>
+    <w:p>
+      <w:pPr>
+        <w:rPr>
+          <w:sz w:val="20"/>
+          <w:szCs w:val="20"/>
+        </w:rPr>
+      </w:pPr>
     </w:p>
     <w:p>
       <w:pPr>
@@ -5716,24 +5792,64 @@
     <w:p>
       <w:pPr>
         <w:rPr>
-          <w:sz w:val="20"/>
-          <w:szCs w:val="20"/>
-        </w:rPr>
-      </w:pPr>
-    </w:p>
-    <w:p>
-      <w:pPr>
-        <w:rPr>
           <w:b/>
           <w:bCs/>
-          <w:sz w:val="20"/>
-          <w:szCs w:val="20"/>
+          <w:sz w:val="22"/>
+          <w:szCs w:val="22"/>
         </w:rPr>
       </w:pPr>
       <w:r>
         <w:rPr>
           <w:b/>
           <w:bCs/>
+          <w:sz w:val="22"/>
+          <w:szCs w:val="22"/>
+        </w:rPr>
+        <w:t xml:space="preserve">Effects on </w:t>
+      </w:r>
+      <w:proofErr w:type="spellStart"/>
+      <w:r>
+        <w:rPr>
+          <w:b/>
+          <w:bCs/>
+          <w:sz w:val="22"/>
+          <w:szCs w:val="22"/>
+        </w:rPr>
+        <w:t>M</w:t>
+      </w:r>
+      <w:r>
+        <w:rPr>
+          <w:b/>
+          <w:bCs/>
+          <w:sz w:val="22"/>
+          <w:szCs w:val="22"/>
+        </w:rPr>
+        <w:t>a</w:t>
+      </w:r>
+      <w:r>
+        <w:rPr>
+          <w:b/>
+          <w:bCs/>
+          <w:sz w:val="22"/>
+          <w:szCs w:val="22"/>
+        </w:rPr>
+        <w:t>crostates</w:t>
+      </w:r>
+      <w:proofErr w:type="spellEnd"/>
+    </w:p>
+    <w:p>
+      <w:pPr>
+        <w:rPr>
+          <w:b/>
+          <w:bCs/>
+          <w:sz w:val="20"/>
+          <w:szCs w:val="20"/>
+        </w:rPr>
+      </w:pPr>
+      <w:r>
+        <w:rPr>
+          <w:b/>
+          <w:bCs/>
           <w:sz w:val="20"/>
           <w:szCs w:val="20"/>
         </w:rPr>
@@ -5770,6 +5886,14 @@
         </w:rPr>
         <w:t xml:space="preserve"> isolated system is defined as,</w:t>
       </w:r>
+    </w:p>
+    <w:p>
+      <w:pPr>
+        <w:rPr>
+          <w:sz w:val="20"/>
+          <w:szCs w:val="20"/>
+        </w:rPr>
+      </w:pPr>
     </w:p>
     <w:p>
       <w:pPr>
@@ -5866,6 +5990,16 @@
           </m:func>
         </m:oMath>
       </m:oMathPara>
+    </w:p>
+    <w:p>
+      <w:pPr>
+        <w:ind w:firstLine="270"/>
+        <w:jc w:val="both"/>
+        <w:rPr>
+          <w:sz w:val="20"/>
+          <w:szCs w:val="20"/>
+        </w:rPr>
+      </w:pPr>
     </w:p>
     <w:p>
       <w:pPr>
@@ -6094,6 +6228,16 @@
           <w:szCs w:val="20"/>
         </w:rPr>
       </w:pPr>
+    </w:p>
+    <w:p>
+      <w:pPr>
+        <w:ind w:firstLine="270"/>
+        <w:jc w:val="both"/>
+        <w:rPr>
+          <w:sz w:val="20"/>
+          <w:szCs w:val="20"/>
+        </w:rPr>
+      </w:pPr>
       <w:r>
         <w:rPr>
           <w:sz w:val="20"/>
@@ -6311,8 +6455,6 @@
     <w:p>
       <w:pPr>
         <w:rPr>
-          <w:b/>
-          <w:bCs/>
           <w:sz w:val="20"/>
           <w:szCs w:val="20"/>
         </w:rPr>
@@ -6332,10 +6474,10 @@
           <w:szCs w:val="20"/>
         </w:rPr>
         <w:drawing>
-          <wp:inline distT="0" distB="0" distL="0" distR="0" wp14:anchorId="428F6E42" wp14:editId="74AB42A9">
+          <wp:inline distT="0" distB="0" distL="0" distR="0" wp14:anchorId="0295A665" wp14:editId="151BAEF4">
             <wp:extent cx="3179445" cy="2080260"/>
             <wp:effectExtent l="0" t="0" r="1905" b="0"/>
-            <wp:docPr id="10" name="Picture 10"/>
+            <wp:docPr id="8" name="Picture 8"/>
             <wp:cNvGraphicFramePr>
               <a:graphicFrameLocks xmlns:a="http://schemas.openxmlformats.org/drawingml/2006/main" noChangeAspect="1"/>
             </wp:cNvGraphicFramePr>
@@ -6371,11 +6513,35 @@
     <w:p>
       <w:pPr>
         <w:ind w:firstLine="270"/>
-        <w:rPr>
-          <w:sz w:val="20"/>
-          <w:szCs w:val="20"/>
-        </w:rPr>
-      </w:pPr>
+        <w:jc w:val="both"/>
+        <w:rPr>
+          <w:sz w:val="20"/>
+          <w:szCs w:val="20"/>
+        </w:rPr>
+      </w:pPr>
+      <w:r>
+        <w:rPr>
+          <w:sz w:val="20"/>
+          <w:szCs w:val="20"/>
+        </w:rPr>
+        <w:t xml:space="preserve">As collisions become more frequent, the distribution spreads and entropy </w:t>
+      </w:r>
+      <w:proofErr w:type="gramStart"/>
+      <w:r>
+        <w:rPr>
+          <w:sz w:val="20"/>
+          <w:szCs w:val="20"/>
+        </w:rPr>
+        <w:t>increases</w:t>
+      </w:r>
+      <w:proofErr w:type="gramEnd"/>
+      <w:r>
+        <w:rPr>
+          <w:sz w:val="20"/>
+          <w:szCs w:val="20"/>
+        </w:rPr>
+        <w:t>. Eventually, the entropy reaches a steady value, indicating that the system has reached equilibrium.</w:t>
+      </w:r>
     </w:p>
     <w:p>
       <w:pPr>
@@ -6386,29 +6552,36 @@
           <w:szCs w:val="20"/>
         </w:rPr>
       </w:pPr>
-      <w:r>
-        <w:rPr>
-          <w:sz w:val="20"/>
-          <w:szCs w:val="20"/>
-        </w:rPr>
-        <w:t xml:space="preserve">As collisions become more frequent, the distribution spreads and entropy </w:t>
-      </w:r>
-      <w:proofErr w:type="gramStart"/>
-      <w:r>
-        <w:rPr>
-          <w:sz w:val="20"/>
-          <w:szCs w:val="20"/>
-        </w:rPr>
-        <w:t>increases</w:t>
-      </w:r>
-      <w:proofErr w:type="gramEnd"/>
-      <w:r>
-        <w:rPr>
-          <w:sz w:val="20"/>
-          <w:szCs w:val="20"/>
-        </w:rPr>
-        <w:t>. Eventually, the entropy reaches a steady value, indicating that the system has reached equilibrium.</w:t>
-      </w:r>
+    </w:p>
+    <w:p>
+      <w:pPr>
+        <w:ind w:firstLine="270"/>
+        <w:jc w:val="both"/>
+        <w:rPr>
+          <w:sz w:val="20"/>
+          <w:szCs w:val="20"/>
+        </w:rPr>
+      </w:pPr>
+    </w:p>
+    <w:p>
+      <w:pPr>
+        <w:ind w:firstLine="270"/>
+        <w:jc w:val="both"/>
+        <w:rPr>
+          <w:sz w:val="20"/>
+          <w:szCs w:val="20"/>
+        </w:rPr>
+      </w:pPr>
+    </w:p>
+    <w:p>
+      <w:pPr>
+        <w:ind w:firstLine="270"/>
+        <w:jc w:val="both"/>
+        <w:rPr>
+          <w:sz w:val="20"/>
+          <w:szCs w:val="20"/>
+        </w:rPr>
+      </w:pPr>
     </w:p>
     <w:p>
       <w:pPr>
@@ -6668,9 +6841,9 @@
           <w:szCs w:val="20"/>
         </w:rPr>
         <w:drawing>
-          <wp:inline distT="0" distB="0" distL="0" distR="0" wp14:anchorId="28EBABF1" wp14:editId="501DCD23">
-            <wp:extent cx="3179445" cy="1946910"/>
-            <wp:effectExtent l="0" t="0" r="1905" b="0"/>
+          <wp:inline distT="0" distB="0" distL="0" distR="0" wp14:anchorId="58B7C2BA" wp14:editId="7EEC1C22">
+            <wp:extent cx="3179445" cy="1935480"/>
+            <wp:effectExtent l="0" t="0" r="1905" b="7620"/>
             <wp:docPr id="5" name="Picture 5"/>
             <wp:cNvGraphicFramePr>
               <a:graphicFrameLocks xmlns:a="http://schemas.openxmlformats.org/drawingml/2006/main" noChangeAspect="1"/>
@@ -6691,7 +6864,7 @@
                   <pic:spPr>
                     <a:xfrm>
                       <a:off x="0" y="0"/>
-                      <a:ext cx="3179445" cy="1946910"/>
+                      <a:ext cx="3179445" cy="1935480"/>
                     </a:xfrm>
                     <a:prstGeom prst="rect">
                       <a:avLst/>
@@ -6836,15 +7009,7 @@
               <w:sz w:val="20"/>
               <w:szCs w:val="20"/>
             </w:rPr>
-            <m:t>T</m:t>
-          </m:r>
-          <m:r>
-            <w:rPr>
-              <w:rFonts w:ascii="Cambria Math" w:hAnsi="Cambria Math"/>
-              <w:sz w:val="20"/>
-              <w:szCs w:val="20"/>
-            </w:rPr>
-            <m:t>=</m:t>
+            <m:t>T=</m:t>
           </m:r>
           <m:d>
             <m:dPr>
@@ -6904,10 +7069,10 @@
           <w:szCs w:val="20"/>
         </w:rPr>
         <w:drawing>
-          <wp:inline distT="0" distB="0" distL="0" distR="0" wp14:anchorId="4DFB6CAF" wp14:editId="303098AC">
+          <wp:inline distT="0" distB="0" distL="0" distR="0" wp14:anchorId="52298587" wp14:editId="059D697F">
             <wp:extent cx="3179445" cy="1935480"/>
             <wp:effectExtent l="0" t="0" r="1905" b="7620"/>
-            <wp:docPr id="7" name="Picture 7"/>
+            <wp:docPr id="12" name="Picture 12"/>
             <wp:cNvGraphicFramePr>
               <a:graphicFrameLocks xmlns:a="http://schemas.openxmlformats.org/drawingml/2006/main" noChangeAspect="1"/>
             </wp:cNvGraphicFramePr>
@@ -6965,17 +7130,1026 @@
         <w:pStyle w:val="ElsParagraph"/>
         <w:ind w:firstLine="0"/>
         <w:rPr>
+          <w:b/>
+          <w:bCs/>
+          <w:sz w:val="22"/>
+          <w:szCs w:val="22"/>
+        </w:rPr>
+      </w:pPr>
+      <w:r>
+        <w:rPr>
+          <w:b/>
+          <w:bCs/>
+          <w:sz w:val="22"/>
+          <w:szCs w:val="22"/>
+        </w:rPr>
+        <w:lastRenderedPageBreak/>
+        <w:t>Pressure</w:t>
+      </w:r>
+      <w:r>
+        <w:rPr>
+          <w:b/>
+          <w:bCs/>
+          <w:sz w:val="22"/>
+          <w:szCs w:val="22"/>
+        </w:rPr>
+        <w:t xml:space="preserve"> Evolution and</w:t>
+      </w:r>
+      <w:r>
+        <w:rPr>
+          <w:b/>
+          <w:bCs/>
+          <w:sz w:val="22"/>
+          <w:szCs w:val="22"/>
+        </w:rPr>
+        <w:t xml:space="preserve"> Equilibrium</w:t>
+      </w:r>
+    </w:p>
+    <w:p>
+      <w:pPr>
+        <w:pStyle w:val="ElsParagraph"/>
+        <w:ind w:firstLine="270"/>
+        <w:rPr>
+          <w:sz w:val="20"/>
+        </w:rPr>
+      </w:pPr>
+      <w:r>
+        <w:rPr>
+          <w:sz w:val="20"/>
+        </w:rPr>
+        <w:t xml:space="preserve">To compute the pressure of the simulated gas, the microscopic definition of pressure in kinetic theory was used. In an ideal gas, pressure arises from the transfer of momentum when particles collide elastically with the container walls. </w:t>
+      </w:r>
+    </w:p>
+    <w:p>
+      <w:pPr>
+        <w:pStyle w:val="ElsParagraph"/>
+        <w:ind w:firstLine="270"/>
+        <w:rPr>
+          <w:sz w:val="20"/>
+        </w:rPr>
+      </w:pPr>
+      <w:r>
+        <w:rPr>
+          <w:sz w:val="20"/>
+        </w:rPr>
+        <w:t>In the simulation, particles move inside a square box of side length ‘</w:t>
+      </w:r>
+      <w:r>
+        <w:rPr>
+          <w:rStyle w:val="katex-mathml"/>
+          <w:sz w:val="20"/>
+        </w:rPr>
+        <w:t>2L’</w:t>
+      </w:r>
+      <w:r>
+        <w:rPr>
+          <w:sz w:val="20"/>
+        </w:rPr>
+        <w:t xml:space="preserve">. Whenever a particle crosses a boundary, an elastic collision with the wall is assumed. During such a collision, the velocity component perpendicular to the wall reverses sign, leading to a change in momentum </w:t>
+      </w:r>
+    </w:p>
+    <w:p>
+      <w:pPr>
+        <w:pStyle w:val="ElsParagraph"/>
+        <w:ind w:firstLine="270"/>
+        <w:rPr>
+          <w:sz w:val="20"/>
+        </w:rPr>
+      </w:pPr>
+    </w:p>
+    <w:p>
+      <w:pPr>
+        <w:pStyle w:val="ElsParagraph"/>
+        <w:ind w:firstLine="270"/>
+        <w:rPr>
+          <w:sz w:val="20"/>
+        </w:rPr>
+      </w:pPr>
+      <w:r>
+        <w:rPr>
           <w:sz w:val="18"/>
           <w:szCs w:val="18"/>
         </w:rPr>
+        <w:tab/>
+      </w:r>
+      <w:r>
+        <w:rPr>
+          <w:sz w:val="18"/>
+          <w:szCs w:val="18"/>
+        </w:rPr>
+        <w:tab/>
+      </w:r>
+      <w:r>
+        <w:rPr>
+          <w:sz w:val="18"/>
+          <w:szCs w:val="18"/>
+        </w:rPr>
+        <w:tab/>
+      </w:r>
+      <m:oMath>
+        <m:r>
+          <m:rPr>
+            <m:sty m:val="p"/>
+          </m:rPr>
+          <w:rPr>
+            <w:rFonts w:ascii="Cambria Math" w:hAnsi="Cambria Math"/>
+            <w:sz w:val="20"/>
+          </w:rPr>
+          <m:t>Δ</m:t>
+        </m:r>
+        <m:r>
+          <w:rPr>
+            <w:rFonts w:ascii="Cambria Math" w:hAnsi="Cambria Math"/>
+            <w:sz w:val="20"/>
+          </w:rPr>
+          <m:t>P=2⋅m⋅</m:t>
+        </m:r>
+        <m:sSub>
+          <m:sSubPr>
+            <m:ctrlPr>
+              <w:rPr>
+                <w:rFonts w:ascii="Cambria Math" w:hAnsi="Cambria Math"/>
+                <w:i/>
+                <w:sz w:val="20"/>
+              </w:rPr>
+            </m:ctrlPr>
+          </m:sSubPr>
+          <m:e>
+            <m:r>
+              <w:rPr>
+                <w:rFonts w:ascii="Cambria Math" w:hAnsi="Cambria Math"/>
+                <w:sz w:val="20"/>
+              </w:rPr>
+              <m:t>v</m:t>
+            </m:r>
+          </m:e>
+          <m:sub>
+            <m:r>
+              <w:rPr>
+                <w:rFonts w:ascii="Cambria Math" w:hAnsi="Cambria Math"/>
+                <w:sz w:val="20"/>
+              </w:rPr>
+              <m:t>⊥</m:t>
+            </m:r>
+          </m:sub>
+        </m:sSub>
+        <m:r>
+          <w:rPr>
+            <w:rFonts w:ascii="Cambria Math" w:hAnsi="Cambria Math"/>
+            <w:sz w:val="20"/>
+          </w:rPr>
+          <m:t xml:space="preserve"> </m:t>
+        </m:r>
+      </m:oMath>
+    </w:p>
+    <w:p>
+      <w:pPr>
+        <w:pStyle w:val="ElsParagraph"/>
+        <w:ind w:firstLine="270"/>
+        <w:rPr>
+          <w:sz w:val="20"/>
+        </w:rPr>
+      </w:pPr>
+    </w:p>
+    <w:p>
+      <w:pPr>
+        <w:pStyle w:val="ElsParagraph"/>
+        <w:ind w:firstLine="270"/>
+        <w:rPr>
+          <w:sz w:val="20"/>
+        </w:rPr>
+      </w:pPr>
+      <w:r>
+        <w:rPr>
+          <w:sz w:val="20"/>
+        </w:rPr>
+        <w:t xml:space="preserve">At every time step, the total impulse delivered to each wall was computed by summing the contributions from all particles that collided with that wall. This produces the time-dependent impulse signal </w:t>
+      </w:r>
+    </w:p>
+    <w:p>
+      <w:pPr>
+        <w:pStyle w:val="ElsParagraph"/>
+        <w:ind w:firstLine="270"/>
+        <w:rPr>
+          <w:sz w:val="20"/>
+        </w:rPr>
+      </w:pPr>
+      <w:r>
+        <w:rPr>
+          <w:sz w:val="20"/>
+        </w:rPr>
+        <w:t>To reduce fluctuations due to the stochastic motion of particles, the impulse data was smoothed using a moving average over 5 steps (</w:t>
+      </w:r>
+      <m:oMath>
+        <m:r>
+          <m:rPr>
+            <m:sty m:val="p"/>
+          </m:rPr>
+          <w:rPr>
+            <w:rFonts w:ascii="Cambria Math" w:hAnsi="Cambria Math"/>
+            <w:sz w:val="20"/>
+          </w:rPr>
+          <m:t>Δ</m:t>
+        </m:r>
+        <m:r>
+          <w:rPr>
+            <w:rFonts w:ascii="Cambria Math" w:hAnsi="Cambria Math"/>
+            <w:sz w:val="20"/>
+          </w:rPr>
+          <m:t>t=0.5 sec</m:t>
+        </m:r>
+      </m:oMath>
+      <w:r>
+        <w:rPr>
+          <w:sz w:val="20"/>
+        </w:rPr>
+        <w:t>).</w:t>
+      </w:r>
+    </w:p>
+    <w:p>
+      <w:pPr>
+        <w:pStyle w:val="ElsParagraph"/>
+        <w:ind w:firstLine="270"/>
+        <w:rPr>
+          <w:sz w:val="20"/>
+        </w:rPr>
+      </w:pPr>
+      <w:r>
+        <w:rPr>
+          <w:sz w:val="20"/>
+        </w:rPr>
+        <w:t>The force on a wall is obtained from the rate of change of momentum,</w:t>
+      </w:r>
+    </w:p>
+    <w:p>
+      <w:pPr>
+        <w:pStyle w:val="ElsParagraph"/>
+        <w:ind w:firstLine="270"/>
+        <w:rPr>
+          <w:sz w:val="20"/>
+        </w:rPr>
+      </w:pPr>
+      <w:r>
+        <w:rPr>
+          <w:sz w:val="20"/>
+        </w:rPr>
+        <w:t xml:space="preserve">In two dimensions, pressure is defined as force per unit wall length. Since the length of each wall in the simulation is </w:t>
+      </w:r>
+      <w:r>
+        <w:rPr>
+          <w:rStyle w:val="katex-mathml"/>
+          <w:sz w:val="20"/>
+        </w:rPr>
+        <w:t>2L</w:t>
+      </w:r>
+      <w:r>
+        <w:rPr>
+          <w:sz w:val="20"/>
+        </w:rPr>
+        <w:t>, the pressure is calculated as</w:t>
+      </w:r>
+    </w:p>
+    <w:p>
+      <w:pPr>
+        <w:pStyle w:val="ElsParagraph"/>
+        <w:spacing w:line="276" w:lineRule="auto"/>
+        <w:ind w:firstLine="270"/>
+        <w:rPr>
+          <w:sz w:val="20"/>
+        </w:rPr>
+      </w:pPr>
+      <m:oMathPara>
+        <m:oMath>
+          <m:r>
+            <w:rPr>
+              <w:rFonts w:ascii="Cambria Math" w:hAnsi="Cambria Math"/>
+              <w:sz w:val="20"/>
+            </w:rPr>
+            <m:t>P</m:t>
+          </m:r>
+          <m:d>
+            <m:dPr>
+              <m:ctrlPr>
+                <w:rPr>
+                  <w:rFonts w:ascii="Cambria Math" w:hAnsi="Cambria Math"/>
+                  <w:i/>
+                  <w:sz w:val="20"/>
+                </w:rPr>
+              </m:ctrlPr>
+            </m:dPr>
+            <m:e>
+              <m:r>
+                <w:rPr>
+                  <w:rFonts w:ascii="Cambria Math" w:hAnsi="Cambria Math"/>
+                  <w:sz w:val="20"/>
+                </w:rPr>
+                <m:t>t</m:t>
+              </m:r>
+            </m:e>
+          </m:d>
+          <m:r>
+            <w:rPr>
+              <w:rFonts w:ascii="Cambria Math" w:hAnsi="Cambria Math"/>
+              <w:sz w:val="20"/>
+            </w:rPr>
+            <m:t>=</m:t>
+          </m:r>
+          <m:f>
+            <m:fPr>
+              <m:ctrlPr>
+                <w:rPr>
+                  <w:rFonts w:ascii="Cambria Math" w:hAnsi="Cambria Math"/>
+                  <w:i/>
+                  <w:sz w:val="20"/>
+                </w:rPr>
+              </m:ctrlPr>
+            </m:fPr>
+            <m:num>
+              <m:r>
+                <w:rPr>
+                  <w:rFonts w:ascii="Cambria Math" w:hAnsi="Cambria Math"/>
+                  <w:sz w:val="20"/>
+                </w:rPr>
+                <m:t>1</m:t>
+              </m:r>
+            </m:num>
+            <m:den>
+              <m:r>
+                <w:rPr>
+                  <w:rFonts w:ascii="Cambria Math" w:hAnsi="Cambria Math"/>
+                  <w:sz w:val="20"/>
+                </w:rPr>
+                <m:t>2L</m:t>
+              </m:r>
+            </m:den>
+          </m:f>
+          <m:d>
+            <m:dPr>
+              <m:ctrlPr>
+                <w:rPr>
+                  <w:rFonts w:ascii="Cambria Math" w:hAnsi="Cambria Math"/>
+                  <w:i/>
+                  <w:sz w:val="20"/>
+                </w:rPr>
+              </m:ctrlPr>
+            </m:dPr>
+            <m:e>
+              <m:f>
+                <m:fPr>
+                  <m:ctrlPr>
+                    <w:rPr>
+                      <w:rFonts w:ascii="Cambria Math" w:hAnsi="Cambria Math"/>
+                      <w:i/>
+                      <w:sz w:val="20"/>
+                    </w:rPr>
+                  </m:ctrlPr>
+                </m:fPr>
+                <m:num>
+                  <m:r>
+                    <m:rPr>
+                      <m:sty m:val="p"/>
+                    </m:rPr>
+                    <w:rPr>
+                      <w:rFonts w:ascii="Cambria Math" w:hAnsi="Cambria Math"/>
+                      <w:sz w:val="20"/>
+                    </w:rPr>
+                    <m:t>Δ</m:t>
+                  </m:r>
+                  <m:r>
+                    <w:rPr>
+                      <w:rFonts w:ascii="Cambria Math" w:hAnsi="Cambria Math"/>
+                      <w:sz w:val="20"/>
+                    </w:rPr>
+                    <m:t>P</m:t>
+                  </m:r>
+                </m:num>
+                <m:den>
+                  <m:r>
+                    <m:rPr>
+                      <m:sty m:val="p"/>
+                    </m:rPr>
+                    <w:rPr>
+                      <w:rFonts w:ascii="Cambria Math" w:hAnsi="Cambria Math"/>
+                      <w:sz w:val="20"/>
+                    </w:rPr>
+                    <m:t>Δ</m:t>
+                  </m:r>
+                  <m:r>
+                    <w:rPr>
+                      <w:rFonts w:ascii="Cambria Math" w:hAnsi="Cambria Math"/>
+                      <w:sz w:val="20"/>
+                    </w:rPr>
+                    <m:t>t</m:t>
+                  </m:r>
+                </m:den>
+              </m:f>
+            </m:e>
+          </m:d>
+        </m:oMath>
+      </m:oMathPara>
+    </w:p>
+    <w:p>
+      <w:pPr>
+        <w:pStyle w:val="ElsParagraph"/>
+        <w:spacing w:line="276" w:lineRule="auto"/>
+        <w:rPr>
+          <w:sz w:val="20"/>
+        </w:rPr>
+      </w:pPr>
+      <w:r>
+        <w:rPr>
+          <w:noProof/>
+          <w:sz w:val="20"/>
+        </w:rPr>
+        <w:drawing>
+          <wp:anchor distT="0" distB="0" distL="114300" distR="114300" simplePos="0" relativeHeight="251660288" behindDoc="0" locked="0" layoutInCell="1" allowOverlap="1" wp14:anchorId="7D5CB840" wp14:editId="23E77C43">
+            <wp:simplePos x="0" y="0"/>
+            <wp:positionH relativeFrom="margin">
+              <wp:align>left</wp:align>
+            </wp:positionH>
+            <wp:positionV relativeFrom="paragraph">
+              <wp:posOffset>213360</wp:posOffset>
+            </wp:positionV>
+            <wp:extent cx="3179445" cy="1978660"/>
+            <wp:effectExtent l="0" t="0" r="1905" b="2540"/>
+            <wp:wrapThrough wrapText="bothSides">
+              <wp:wrapPolygon edited="0">
+                <wp:start x="0" y="0"/>
+                <wp:lineTo x="0" y="21420"/>
+                <wp:lineTo x="21484" y="21420"/>
+                <wp:lineTo x="21484" y="0"/>
+                <wp:lineTo x="0" y="0"/>
+              </wp:wrapPolygon>
+            </wp:wrapThrough>
+            <wp:docPr id="15" name="Picture 15"/>
+            <wp:cNvGraphicFramePr>
+              <a:graphicFrameLocks xmlns:a="http://schemas.openxmlformats.org/drawingml/2006/main" noChangeAspect="1"/>
+            </wp:cNvGraphicFramePr>
+            <a:graphic xmlns:a="http://schemas.openxmlformats.org/drawingml/2006/main">
+              <a:graphicData uri="http://schemas.openxmlformats.org/drawingml/2006/picture">
+                <pic:pic xmlns:pic="http://schemas.openxmlformats.org/drawingml/2006/picture">
+                  <pic:nvPicPr>
+                    <pic:cNvPr id="1" name=""/>
+                    <pic:cNvPicPr/>
+                  </pic:nvPicPr>
+                  <pic:blipFill>
+                    <a:blip r:embed="rId21">
+                      <a:extLst>
+                        <a:ext uri="{28A0092B-C50C-407E-A947-70E740481C1C}">
+                          <a14:useLocalDpi xmlns:a14="http://schemas.microsoft.com/office/drawing/2010/main" val="0"/>
+                        </a:ext>
+                      </a:extLst>
+                    </a:blip>
+                    <a:stretch>
+                      <a:fillRect/>
+                    </a:stretch>
+                  </pic:blipFill>
+                  <pic:spPr>
+                    <a:xfrm>
+                      <a:off x="0" y="0"/>
+                      <a:ext cx="3179445" cy="1978660"/>
+                    </a:xfrm>
+                    <a:prstGeom prst="rect">
+                      <a:avLst/>
+                    </a:prstGeom>
+                  </pic:spPr>
+                </pic:pic>
+              </a:graphicData>
+            </a:graphic>
+          </wp:anchor>
+        </w:drawing>
+      </w:r>
+    </w:p>
+    <w:p>
+      <w:pPr>
+        <w:pStyle w:val="ElsParagraph"/>
+        <w:spacing w:line="240" w:lineRule="auto"/>
+        <w:ind w:firstLine="270"/>
+        <w:rPr>
+          <w:sz w:val="20"/>
+        </w:rPr>
+      </w:pPr>
+    </w:p>
+    <w:p>
+      <w:pPr>
+        <w:pStyle w:val="ElsParagraph"/>
+        <w:spacing w:line="240" w:lineRule="auto"/>
+        <w:ind w:firstLine="270"/>
+        <w:rPr>
+          <w:sz w:val="20"/>
+        </w:rPr>
+      </w:pPr>
+      <w:r>
+        <w:rPr>
+          <w:sz w:val="20"/>
+        </w:rPr>
+        <w:t>At the beginning of the simulation, the pressure is highly non-uniform and fluctuates strongly. The right wall exhibits a sharp spike, reaching values much larger than the later steady value.</w:t>
+      </w:r>
+    </w:p>
+    <w:p>
+      <w:pPr>
+        <w:pStyle w:val="ElsParagraph"/>
+        <w:spacing w:line="240" w:lineRule="auto"/>
+        <w:ind w:firstLine="270"/>
+        <w:rPr>
+          <w:sz w:val="20"/>
+          <w:lang w:val="en-IN"/>
+        </w:rPr>
+      </w:pPr>
+      <w:r>
+        <w:rPr>
+          <w:sz w:val="20"/>
+          <w:lang w:val="en-IN"/>
+        </w:rPr>
+        <w:t>This behaviour occurs because the particles are initially far from equilibrium. Their velocities and spatial distribution are not yet isotropic, causing clusters of particles to hit certain walls more frequently. As a result, the momentum transfer to the walls is uneven, producing large fluctuations and transient pressure peaks.</w:t>
+      </w:r>
+    </w:p>
+    <w:p>
+      <w:pPr>
+        <w:pStyle w:val="ElsParagraph"/>
+        <w:spacing w:line="240" w:lineRule="auto"/>
+        <w:ind w:firstLine="270"/>
+        <w:rPr>
+          <w:sz w:val="20"/>
+        </w:rPr>
+      </w:pPr>
+      <w:r>
+        <w:rPr>
+          <w:sz w:val="20"/>
+        </w:rPr>
+        <w:t xml:space="preserve">After the initial spike, the pressure at the right wall quickly decreases and approaches the values measured at the top wall. </w:t>
+      </w:r>
+      <w:r>
+        <w:rPr>
+          <w:sz w:val="20"/>
+        </w:rPr>
+        <w:t>This indicates that the directional bias in particle motion is disappearing.</w:t>
+      </w:r>
+    </w:p>
+    <w:p>
+      <w:pPr>
+        <w:pStyle w:val="ElsParagraph"/>
+        <w:spacing w:line="240" w:lineRule="auto"/>
+        <w:ind w:firstLine="270"/>
+        <w:rPr>
+          <w:sz w:val="20"/>
+        </w:rPr>
+      </w:pPr>
+      <w:r>
+        <w:rPr>
+          <w:sz w:val="20"/>
+        </w:rPr>
+        <w:t>Collisions between particles redistribute kinetic energy and randomize the velocity directions. This process drives the system toward isotropy, a key requirement for thermodynamic equilibrium.</w:t>
+      </w:r>
+    </w:p>
+    <w:p>
+      <w:pPr>
+        <w:pStyle w:val="ElsParagraph"/>
+        <w:spacing w:line="240" w:lineRule="auto"/>
+        <w:ind w:firstLine="270"/>
+        <w:rPr>
+          <w:sz w:val="20"/>
+        </w:rPr>
+      </w:pPr>
+      <w:r>
+        <w:rPr>
+          <w:sz w:val="20"/>
+        </w:rPr>
+        <w:t>Even in the steady state, the pressure continues to fluctuate slightly. This is expected because the simulation contains a finite number of particles.</w:t>
+      </w:r>
+    </w:p>
+    <w:p>
+      <w:pPr>
+        <w:pStyle w:val="ElsParagraph"/>
+        <w:spacing w:line="240" w:lineRule="auto"/>
+        <w:ind w:firstLine="270"/>
+        <w:rPr>
+          <w:sz w:val="20"/>
+        </w:rPr>
+      </w:pPr>
+      <w:r>
+        <w:rPr>
+          <w:sz w:val="20"/>
+        </w:rPr>
+        <w:t xml:space="preserve">The pressure on two perpendicular walls </w:t>
+      </w:r>
+      <w:proofErr w:type="gramStart"/>
+      <w:r>
+        <w:rPr>
+          <w:sz w:val="20"/>
+        </w:rPr>
+        <w:t>are</w:t>
+      </w:r>
+      <w:proofErr w:type="gramEnd"/>
+      <w:r>
+        <w:rPr>
+          <w:sz w:val="20"/>
+        </w:rPr>
+        <w:t xml:space="preserve"> getting identical and approaching towards 3</w:t>
+      </w:r>
+      <w:r>
+        <w:rPr>
+          <w:sz w:val="20"/>
+        </w:rPr>
+        <w:t xml:space="preserve">.3 </w:t>
+      </w:r>
+      <m:oMath>
+        <m:sSup>
+          <m:sSupPr>
+            <m:ctrlPr>
+              <w:rPr>
+                <w:rFonts w:ascii="Cambria Math" w:hAnsi="Cambria Math"/>
+                <w:i/>
+                <w:sz w:val="20"/>
+              </w:rPr>
+            </m:ctrlPr>
+          </m:sSupPr>
+          <m:e>
+            <m:r>
+              <w:rPr>
+                <w:rFonts w:ascii="Cambria Math" w:hAnsi="Cambria Math"/>
+                <w:sz w:val="20"/>
+              </w:rPr>
+              <m:t>10</m:t>
+            </m:r>
+          </m:e>
+          <m:sup>
+            <m:r>
+              <w:rPr>
+                <w:rFonts w:ascii="Cambria Math" w:hAnsi="Cambria Math"/>
+                <w:sz w:val="20"/>
+              </w:rPr>
+              <m:t>-24</m:t>
+            </m:r>
+          </m:sup>
+        </m:sSup>
+      </m:oMath>
+      <w:r>
+        <w:rPr>
+          <w:sz w:val="20"/>
+        </w:rPr>
+        <w:t xml:space="preserve"> Pa, which is quite close to the theoretical </w:t>
+      </w:r>
+      <w:r>
+        <w:rPr>
+          <w:sz w:val="20"/>
+        </w:rPr>
+        <w:t>Ideal gas law of 2D particles</w:t>
+      </w:r>
+      <w:r>
+        <w:rPr>
+          <w:sz w:val="20"/>
+        </w:rPr>
+        <w:t>,</w:t>
+      </w:r>
+    </w:p>
+    <w:p>
+      <w:pPr>
+        <w:pStyle w:val="ElsParagraph"/>
+        <w:spacing w:line="276" w:lineRule="auto"/>
+        <w:ind w:firstLine="270"/>
+        <w:rPr>
+          <w:sz w:val="20"/>
+        </w:rPr>
+      </w:pPr>
+    </w:p>
+    <w:p>
+      <w:pPr>
+        <w:pStyle w:val="ElsParagraph"/>
+        <w:spacing w:line="276" w:lineRule="auto"/>
+        <w:ind w:firstLine="0"/>
+        <w:rPr>
+          <w:sz w:val="20"/>
+        </w:rPr>
+      </w:pPr>
+      <m:oMathPara>
+        <m:oMath>
+          <m:r>
+            <w:rPr>
+              <w:rFonts w:ascii="Cambria Math" w:hAnsi="Cambria Math"/>
+              <w:sz w:val="20"/>
+            </w:rPr>
+            <m:t>PA=</m:t>
+          </m:r>
+          <m:f>
+            <m:fPr>
+              <m:ctrlPr>
+                <w:rPr>
+                  <w:rFonts w:ascii="Cambria Math" w:hAnsi="Cambria Math"/>
+                  <w:i/>
+                  <w:sz w:val="20"/>
+                </w:rPr>
+              </m:ctrlPr>
+            </m:fPr>
+            <m:num>
+              <m:r>
+                <w:rPr>
+                  <w:rFonts w:ascii="Cambria Math" w:hAnsi="Cambria Math"/>
+                  <w:sz w:val="20"/>
+                </w:rPr>
+                <m:t>1</m:t>
+              </m:r>
+            </m:num>
+            <m:den>
+              <m:r>
+                <w:rPr>
+                  <w:rFonts w:ascii="Cambria Math" w:hAnsi="Cambria Math"/>
+                  <w:sz w:val="20"/>
+                </w:rPr>
+                <m:t>2</m:t>
+              </m:r>
+            </m:den>
+          </m:f>
+          <m:r>
+            <w:rPr>
+              <w:rFonts w:ascii="Cambria Math" w:hAnsi="Cambria Math"/>
+              <w:sz w:val="20"/>
+            </w:rPr>
+            <m:t>Nm⟨</m:t>
+          </m:r>
+          <m:sSup>
+            <m:sSupPr>
+              <m:ctrlPr>
+                <w:rPr>
+                  <w:rFonts w:ascii="Cambria Math" w:hAnsi="Cambria Math"/>
+                  <w:i/>
+                  <w:sz w:val="20"/>
+                </w:rPr>
+              </m:ctrlPr>
+            </m:sSupPr>
+            <m:e>
+              <m:r>
+                <w:rPr>
+                  <w:rFonts w:ascii="Cambria Math" w:hAnsi="Cambria Math"/>
+                  <w:sz w:val="20"/>
+                </w:rPr>
+                <m:t>v</m:t>
+              </m:r>
+            </m:e>
+            <m:sup>
+              <m:r>
+                <w:rPr>
+                  <w:rFonts w:ascii="Cambria Math" w:hAnsi="Cambria Math"/>
+                  <w:sz w:val="20"/>
+                </w:rPr>
+                <m:t>2</m:t>
+              </m:r>
+            </m:sup>
+          </m:sSup>
+          <m:r>
+            <w:rPr>
+              <w:rFonts w:ascii="Cambria Math" w:hAnsi="Cambria Math"/>
+              <w:sz w:val="20"/>
+            </w:rPr>
+            <m:t>⟩</m:t>
+          </m:r>
+        </m:oMath>
+      </m:oMathPara>
+    </w:p>
+    <w:p>
+      <w:pPr>
+        <w:pStyle w:val="ElsParagraph"/>
+        <w:spacing w:line="276" w:lineRule="auto"/>
+        <w:ind w:firstLine="270"/>
+        <w:rPr>
+          <w:sz w:val="20"/>
+        </w:rPr>
+      </w:pPr>
+      <m:oMathPara>
+        <m:oMath>
+          <m:sSub>
+            <m:sSubPr>
+              <m:ctrlPr>
+                <w:rPr>
+                  <w:rFonts w:ascii="Cambria Math" w:hAnsi="Cambria Math"/>
+                  <w:i/>
+                  <w:sz w:val="20"/>
+                </w:rPr>
+              </m:ctrlPr>
+            </m:sSubPr>
+            <m:e>
+              <m:r>
+                <w:rPr>
+                  <w:rFonts w:ascii="Cambria Math" w:hAnsi="Cambria Math"/>
+                  <w:sz w:val="20"/>
+                </w:rPr>
+                <m:t>P</m:t>
+              </m:r>
+            </m:e>
+            <m:sub>
+              <m:r>
+                <w:rPr>
+                  <w:rFonts w:ascii="Cambria Math" w:hAnsi="Cambria Math"/>
+                  <w:sz w:val="20"/>
+                </w:rPr>
+                <m:t>x</m:t>
+              </m:r>
+            </m:sub>
+          </m:sSub>
+          <m:r>
+            <w:rPr>
+              <w:rFonts w:ascii="Cambria Math" w:hAnsi="Cambria Math"/>
+              <w:sz w:val="20"/>
+            </w:rPr>
+            <m:t>≈</m:t>
+          </m:r>
+          <m:sSub>
+            <m:sSubPr>
+              <m:ctrlPr>
+                <w:rPr>
+                  <w:rFonts w:ascii="Cambria Math" w:hAnsi="Cambria Math"/>
+                  <w:i/>
+                  <w:sz w:val="20"/>
+                </w:rPr>
+              </m:ctrlPr>
+            </m:sSubPr>
+            <m:e>
+              <m:r>
+                <w:rPr>
+                  <w:rFonts w:ascii="Cambria Math" w:hAnsi="Cambria Math"/>
+                  <w:sz w:val="20"/>
+                </w:rPr>
+                <m:t>P</m:t>
+              </m:r>
+            </m:e>
+            <m:sub>
+              <m:r>
+                <w:rPr>
+                  <w:rFonts w:ascii="Cambria Math" w:hAnsi="Cambria Math"/>
+                  <w:sz w:val="20"/>
+                </w:rPr>
+                <m:t>y</m:t>
+              </m:r>
+            </m:sub>
+          </m:sSub>
+          <m:r>
+            <w:rPr>
+              <w:rFonts w:ascii="Cambria Math" w:hAnsi="Cambria Math"/>
+              <w:sz w:val="20"/>
+            </w:rPr>
+            <m:t>≈3.3*</m:t>
+          </m:r>
+          <m:sSup>
+            <m:sSupPr>
+              <m:ctrlPr>
+                <w:rPr>
+                  <w:rFonts w:ascii="Cambria Math" w:hAnsi="Cambria Math"/>
+                  <w:i/>
+                  <w:sz w:val="20"/>
+                </w:rPr>
+              </m:ctrlPr>
+            </m:sSupPr>
+            <m:e>
+              <m:r>
+                <w:rPr>
+                  <w:rFonts w:ascii="Cambria Math" w:hAnsi="Cambria Math"/>
+                  <w:sz w:val="20"/>
+                </w:rPr>
+                <m:t>10</m:t>
+              </m:r>
+            </m:e>
+            <m:sup>
+              <m:r>
+                <w:rPr>
+                  <w:rFonts w:ascii="Cambria Math" w:hAnsi="Cambria Math"/>
+                  <w:sz w:val="20"/>
+                </w:rPr>
+                <m:t>-24</m:t>
+              </m:r>
+            </m:sup>
+          </m:sSup>
+          <m:r>
+            <w:rPr>
+              <w:rFonts w:ascii="Cambria Math" w:hAnsi="Cambria Math"/>
+              <w:sz w:val="20"/>
+            </w:rPr>
+            <m:t xml:space="preserve"> Pa </m:t>
+          </m:r>
+        </m:oMath>
+      </m:oMathPara>
+    </w:p>
+    <w:p>
+      <w:pPr>
+        <w:pStyle w:val="ElsParagraph"/>
+        <w:spacing w:line="276" w:lineRule="auto"/>
+        <w:ind w:firstLine="270"/>
+        <w:rPr>
+          <w:sz w:val="20"/>
+        </w:rPr>
+      </w:pPr>
+      <m:oMathPara>
+        <m:oMath>
+          <m:sSub>
+            <m:sSubPr>
+              <m:ctrlPr>
+                <w:rPr>
+                  <w:rFonts w:ascii="Cambria Math" w:hAnsi="Cambria Math"/>
+                  <w:i/>
+                  <w:sz w:val="20"/>
+                </w:rPr>
+              </m:ctrlPr>
+            </m:sSubPr>
+            <m:e>
+              <m:r>
+                <w:rPr>
+                  <w:rFonts w:ascii="Cambria Math" w:hAnsi="Cambria Math"/>
+                  <w:sz w:val="20"/>
+                </w:rPr>
+                <m:t>P</m:t>
+              </m:r>
+            </m:e>
+            <m:sub>
+              <m:r>
+                <w:rPr>
+                  <w:rFonts w:ascii="Cambria Math" w:hAnsi="Cambria Math"/>
+                  <w:sz w:val="20"/>
+                </w:rPr>
+                <m:t xml:space="preserve">ideal </m:t>
+              </m:r>
+            </m:sub>
+          </m:sSub>
+          <m:r>
+            <w:rPr>
+              <w:rFonts w:ascii="Cambria Math" w:hAnsi="Cambria Math"/>
+              <w:sz w:val="20"/>
+            </w:rPr>
+            <m:t>≈3.9*</m:t>
+          </m:r>
+          <m:sSup>
+            <m:sSupPr>
+              <m:ctrlPr>
+                <w:rPr>
+                  <w:rFonts w:ascii="Cambria Math" w:hAnsi="Cambria Math"/>
+                  <w:i/>
+                  <w:sz w:val="20"/>
+                </w:rPr>
+              </m:ctrlPr>
+            </m:sSupPr>
+            <m:e>
+              <m:r>
+                <w:rPr>
+                  <w:rFonts w:ascii="Cambria Math" w:hAnsi="Cambria Math"/>
+                  <w:sz w:val="20"/>
+                </w:rPr>
+                <m:t>10</m:t>
+              </m:r>
+            </m:e>
+            <m:sup>
+              <m:r>
+                <w:rPr>
+                  <w:rFonts w:ascii="Cambria Math" w:hAnsi="Cambria Math"/>
+                  <w:sz w:val="20"/>
+                </w:rPr>
+                <m:t>-24</m:t>
+              </m:r>
+            </m:sup>
+          </m:sSup>
+          <m:r>
+            <w:rPr>
+              <w:rFonts w:ascii="Cambria Math" w:hAnsi="Cambria Math"/>
+              <w:sz w:val="20"/>
+            </w:rPr>
+            <m:t xml:space="preserve"> Pa</m:t>
+          </m:r>
+        </m:oMath>
+      </m:oMathPara>
+    </w:p>
+    <w:p>
+      <w:pPr>
+        <w:pStyle w:val="ElsParagraph"/>
+        <w:spacing w:line="276" w:lineRule="auto"/>
+        <w:ind w:firstLine="270"/>
+        <w:rPr>
+          <w:sz w:val="20"/>
+        </w:rPr>
+      </w:pPr>
+    </w:p>
+    <w:p>
+      <w:pPr>
+        <w:pStyle w:val="ElsParagraph"/>
+        <w:spacing w:line="276" w:lineRule="auto"/>
+        <w:ind w:firstLine="270"/>
+        <w:rPr>
+          <w:sz w:val="20"/>
+        </w:rPr>
+      </w:pPr>
+    </w:p>
+    <w:p>
+      <w:pPr>
+        <w:pStyle w:val="ElsParagraph"/>
+        <w:spacing w:line="276" w:lineRule="auto"/>
+        <w:ind w:firstLine="270"/>
+        <w:rPr>
+          <w:sz w:val="20"/>
+        </w:rPr>
       </w:pPr>
     </w:p>
     <w:sectPr>
-      <w:headerReference w:type="even" r:id="rId21"/>
+      <w:headerReference w:type="even" r:id="rId22"/>
       <w:type w:val="continuous"/>
       <w:pgSz w:w="11906" w:h="16838" w:code="9"/>
       <w:pgMar w:top="964" w:right="851" w:bottom="1242" w:left="680" w:header="720" w:footer="238" w:gutter="0"/>
-      <w:cols w:space="360"/>
+      <w:cols w:num="2" w:space="360"/>
     </w:sectPr>
   </w:body>
 </w:document>
@@ -8682,6 +9856,16 @@
       </w:tblBorders>
     </w:tblPr>
   </w:style>
+  <w:style w:type="character" w:customStyle="1" w:styleId="katex-mathml">
+    <w:name w:val="katex-mathml"/>
+    <w:basedOn w:val="DefaultParagraphFont"/>
+    <w:rsid w:val="007F296D"/>
+  </w:style>
+  <w:style w:type="character" w:customStyle="1" w:styleId="mord">
+    <w:name w:val="mord"/>
+    <w:basedOn w:val="DefaultParagraphFont"/>
+    <w:rsid w:val="007F296D"/>
+  </w:style>
 </w:styles>
 </file>
 

</xml_diff>